<commit_message>
Creacion de diagrama de GANTT
</commit_message>
<xml_diff>
--- a/listadoRequisitos.docx
+++ b/listadoRequisitos.docx
@@ -1,6 +1,6 @@
 
 <file path=word/document.xml><?xml version="1.0" encoding="utf-8"?>
-<w:document xmlns:wpc="http://schemas.microsoft.com/office/word/2010/wordprocessingCanvas" xmlns:cx="http://schemas.microsoft.com/office/drawing/2014/chartex" xmlns:cx1="http://schemas.microsoft.com/office/drawing/2015/9/8/chartex" xmlns:cx2="http://schemas.microsoft.com/office/drawing/2015/10/21/chartex" xmlns:cx3="http://schemas.microsoft.com/office/drawing/2016/5/9/chartex" xmlns:cx4="http://schemas.microsoft.com/office/drawing/2016/5/10/chartex" xmlns:cx5="http://schemas.microsoft.com/office/drawing/2016/5/11/chartex" xmlns:cx6="http://schemas.microsoft.com/office/drawing/2016/5/12/chartex" xmlns:cx7="http://schemas.microsoft.com/office/drawing/2016/5/13/chartex" xmlns:cx8="http://schemas.microsoft.com/office/drawing/2016/5/14/chartex" xmlns:mc="http://schemas.openxmlformats.org/markup-compatibility/2006" xmlns:aink="http://schemas.microsoft.com/office/drawing/2016/ink" xmlns:am3d="http://schemas.microsoft.com/office/drawing/2017/model3d" xmlns:o="urn:schemas-microsoft-com:office:office" xmlns:oel="http://schemas.microsoft.com/office/2019/extlst" xmlns:r="http://schemas.openxmlformats.org/officeDocument/2006/relationships" xmlns:m="http://schemas.openxmlformats.org/officeDocument/2006/math" xmlns:v="urn:schemas-microsoft-com:vml" xmlns:wp14="http://schemas.microsoft.com/office/word/2010/wordprocessingDrawing" xmlns:wp="http://schemas.openxmlformats.org/drawingml/2006/wordprocessingDrawing" xmlns:w10="urn:schemas-microsoft-com:office:word" xmlns:w="http://schemas.openxmlformats.org/wordprocessingml/2006/main" xmlns:w14="http://schemas.microsoft.com/office/word/2010/wordml" xmlns:w15="http://schemas.microsoft.com/office/word/2012/wordml" xmlns:w16cex="http://schemas.microsoft.com/office/word/2018/wordml/cex" xmlns:w16cid="http://schemas.microsoft.com/office/word/2016/wordml/cid" xmlns:w16="http://schemas.microsoft.com/office/word/2018/wordml" xmlns:w16du="http://schemas.microsoft.com/office/word/2023/wordml/word16du" xmlns:w16sdtdh="http://schemas.microsoft.com/office/word/2020/wordml/sdtdatahash" xmlns:w16sdtfl="http://schemas.microsoft.com/office/word/2024/wordml/sdtformatlock" xmlns:w16se="http://schemas.microsoft.com/office/word/2015/wordml/symex" xmlns:wpg="http://schemas.microsoft.com/office/word/2010/wordprocessingGroup" xmlns:wpi="http://schemas.microsoft.com/office/word/2010/wordprocessingInk" xmlns:wne="http://schemas.microsoft.com/office/word/2006/wordml" xmlns:wps="http://schemas.microsoft.com/office/word/2010/wordprocessingShape" mc:Ignorable="w14 w15 w16se w16cid w16 w16cex w16sdtdh w16sdtfl w16du wp14">
+<w:document xmlns:wpc="http://schemas.microsoft.com/office/word/2010/wordprocessingCanvas" xmlns:cx="http://schemas.microsoft.com/office/drawing/2014/chartex" xmlns:cx1="http://schemas.microsoft.com/office/drawing/2015/9/8/chartex" xmlns:cx2="http://schemas.microsoft.com/office/drawing/2015/10/21/chartex" xmlns:cx3="http://schemas.microsoft.com/office/drawing/2016/5/9/chartex" xmlns:cx4="http://schemas.microsoft.com/office/drawing/2016/5/10/chartex" xmlns:cx5="http://schemas.microsoft.com/office/drawing/2016/5/11/chartex" xmlns:cx6="http://schemas.microsoft.com/office/drawing/2016/5/12/chartex" xmlns:cx7="http://schemas.microsoft.com/office/drawing/2016/5/13/chartex" xmlns:cx8="http://schemas.microsoft.com/office/drawing/2016/5/14/chartex" xmlns:mc="http://schemas.openxmlformats.org/markup-compatibility/2006" xmlns:aink="http://schemas.microsoft.com/office/drawing/2016/ink" xmlns:am3d="http://schemas.microsoft.com/office/drawing/2017/model3d" xmlns:o="urn:schemas-microsoft-com:office:office" xmlns:r="http://schemas.openxmlformats.org/officeDocument/2006/relationships" xmlns:m="http://schemas.openxmlformats.org/officeDocument/2006/math" xmlns:v="urn:schemas-microsoft-com:vml" xmlns:wp14="http://schemas.microsoft.com/office/word/2010/wordprocessingDrawing" xmlns:wp="http://schemas.openxmlformats.org/drawingml/2006/wordprocessingDrawing" xmlns:w10="urn:schemas-microsoft-com:office:word" xmlns:w="http://schemas.openxmlformats.org/wordprocessingml/2006/main" xmlns:w14="http://schemas.microsoft.com/office/word/2010/wordml" xmlns:w15="http://schemas.microsoft.com/office/word/2012/wordml" xmlns:w16cex="http://schemas.microsoft.com/office/word/2018/wordml/cex" xmlns:w16cid="http://schemas.microsoft.com/office/word/2016/wordml/cid" xmlns:w16="http://schemas.microsoft.com/office/word/2018/wordml" xmlns:w16sdtdh="http://schemas.microsoft.com/office/word/2020/wordml/sdtdatahash" xmlns:w16se="http://schemas.microsoft.com/office/word/2015/wordml/symex" xmlns:wpg="http://schemas.microsoft.com/office/word/2010/wordprocessingGroup" xmlns:wpi="http://schemas.microsoft.com/office/word/2010/wordprocessingInk" xmlns:wne="http://schemas.microsoft.com/office/word/2006/wordml" xmlns:wps="http://schemas.microsoft.com/office/word/2010/wordprocessingShape" mc:Ignorable="w14 w15 w16se w16cid w16 w16cex w16sdtdh wp14">
   <w:body>
     <w:p>
       <w:pPr>
@@ -252,13 +252,7 @@
               <w:rPr>
                 <w:rFonts w:ascii="Calibri" w:hAnsi="Calibri" w:cs="Calibri"/>
               </w:rPr>
-              <w:t>RFP-00</w:t>
-            </w:r>
-            <w:r>
-              <w:rPr>
-                <w:rFonts w:ascii="Calibri" w:hAnsi="Calibri" w:cs="Calibri"/>
-              </w:rPr>
-              <w:t>2</w:t>
+              <w:t>RFP-002</w:t>
             </w:r>
           </w:p>
         </w:tc>
@@ -1981,13 +1975,7 @@
               <w:rPr>
                 <w:rFonts w:ascii="Calibri" w:hAnsi="Calibri" w:cs="Calibri"/>
               </w:rPr>
-              <w:t>1</w:t>
-            </w:r>
-            <w:r>
-              <w:rPr>
-                <w:rFonts w:ascii="Calibri" w:hAnsi="Calibri" w:cs="Calibri"/>
-              </w:rPr>
-              <w:t>1</w:t>
+              <w:t>11</w:t>
             </w:r>
           </w:p>
         </w:tc>
@@ -2172,13 +2160,7 @@
               <w:rPr>
                 <w:rFonts w:ascii="Calibri" w:hAnsi="Calibri" w:cs="Calibri"/>
               </w:rPr>
-              <w:t>1</w:t>
-            </w:r>
-            <w:r>
-              <w:rPr>
-                <w:rFonts w:ascii="Calibri" w:hAnsi="Calibri" w:cs="Calibri"/>
-              </w:rPr>
-              <w:t>2</w:t>
+              <w:t>12</w:t>
             </w:r>
           </w:p>
         </w:tc>
@@ -2298,7 +2280,7 @@
               <w:rPr>
                 <w:rFonts w:ascii="Calibri" w:hAnsi="Calibri" w:cs="Calibri"/>
               </w:rPr>
-              <w:t>Alta</w:t>
+              <w:t>Media</w:t>
             </w:r>
           </w:p>
         </w:tc>
@@ -2489,7 +2471,7 @@
               <w:rPr>
                 <w:rFonts w:ascii="Calibri" w:hAnsi="Calibri" w:cs="Calibri"/>
               </w:rPr>
-              <w:t>Alta</w:t>
+              <w:t>Media</w:t>
             </w:r>
           </w:p>
         </w:tc>
@@ -2554,13 +2536,7 @@
               <w:rPr>
                 <w:rFonts w:ascii="Calibri" w:hAnsi="Calibri" w:cs="Calibri"/>
               </w:rPr>
-              <w:t>1</w:t>
-            </w:r>
-            <w:r>
-              <w:rPr>
-                <w:rFonts w:ascii="Calibri" w:hAnsi="Calibri" w:cs="Calibri"/>
-              </w:rPr>
-              <w:t>4</w:t>
+              <w:t>14</w:t>
             </w:r>
           </w:p>
         </w:tc>
@@ -2770,13 +2746,7 @@
               <w:rPr>
                 <w:rFonts w:ascii="Calibri" w:hAnsi="Calibri" w:cs="Calibri"/>
               </w:rPr>
-              <w:t>1</w:t>
-            </w:r>
-            <w:r>
-              <w:rPr>
-                <w:rFonts w:ascii="Calibri" w:hAnsi="Calibri" w:cs="Calibri"/>
-              </w:rPr>
-              <w:t>5</w:t>
+              <w:t>15</w:t>
             </w:r>
           </w:p>
         </w:tc>
@@ -2922,7 +2892,7 @@
 </file>
 
 <file path=word/endnotes.xml><?xml version="1.0" encoding="utf-8"?>
-<w:endnotes xmlns:wpc="http://schemas.microsoft.com/office/word/2010/wordprocessingCanvas" xmlns:cx="http://schemas.microsoft.com/office/drawing/2014/chartex" xmlns:cx1="http://schemas.microsoft.com/office/drawing/2015/9/8/chartex" xmlns:cx2="http://schemas.microsoft.com/office/drawing/2015/10/21/chartex" xmlns:cx3="http://schemas.microsoft.com/office/drawing/2016/5/9/chartex" xmlns:cx4="http://schemas.microsoft.com/office/drawing/2016/5/10/chartex" xmlns:cx5="http://schemas.microsoft.com/office/drawing/2016/5/11/chartex" xmlns:cx6="http://schemas.microsoft.com/office/drawing/2016/5/12/chartex" xmlns:cx7="http://schemas.microsoft.com/office/drawing/2016/5/13/chartex" xmlns:cx8="http://schemas.microsoft.com/office/drawing/2016/5/14/chartex" xmlns:mc="http://schemas.openxmlformats.org/markup-compatibility/2006" xmlns:aink="http://schemas.microsoft.com/office/drawing/2016/ink" xmlns:am3d="http://schemas.microsoft.com/office/drawing/2017/model3d" xmlns:o="urn:schemas-microsoft-com:office:office" xmlns:oel="http://schemas.microsoft.com/office/2019/extlst" xmlns:r="http://schemas.openxmlformats.org/officeDocument/2006/relationships" xmlns:m="http://schemas.openxmlformats.org/officeDocument/2006/math" xmlns:v="urn:schemas-microsoft-com:vml" xmlns:wp14="http://schemas.microsoft.com/office/word/2010/wordprocessingDrawing" xmlns:wp="http://schemas.openxmlformats.org/drawingml/2006/wordprocessingDrawing" xmlns:w10="urn:schemas-microsoft-com:office:word" xmlns:w="http://schemas.openxmlformats.org/wordprocessingml/2006/main" xmlns:w14="http://schemas.microsoft.com/office/word/2010/wordml" xmlns:w15="http://schemas.microsoft.com/office/word/2012/wordml" xmlns:w16cex="http://schemas.microsoft.com/office/word/2018/wordml/cex" xmlns:w16cid="http://schemas.microsoft.com/office/word/2016/wordml/cid" xmlns:w16="http://schemas.microsoft.com/office/word/2018/wordml" xmlns:w16du="http://schemas.microsoft.com/office/word/2023/wordml/word16du" xmlns:w16sdtdh="http://schemas.microsoft.com/office/word/2020/wordml/sdtdatahash" xmlns:w16sdtfl="http://schemas.microsoft.com/office/word/2024/wordml/sdtformatlock" xmlns:w16se="http://schemas.microsoft.com/office/word/2015/wordml/symex" xmlns:wpg="http://schemas.microsoft.com/office/word/2010/wordprocessingGroup" xmlns:wpi="http://schemas.microsoft.com/office/word/2010/wordprocessingInk" xmlns:wne="http://schemas.microsoft.com/office/word/2006/wordml" xmlns:wps="http://schemas.microsoft.com/office/word/2010/wordprocessingShape" mc:Ignorable="w14 w15 w16se w16cid w16 w16cex w16sdtdh w16sdtfl w16du wp14">
+<w:endnotes xmlns:wpc="http://schemas.microsoft.com/office/word/2010/wordprocessingCanvas" xmlns:cx="http://schemas.microsoft.com/office/drawing/2014/chartex" xmlns:cx1="http://schemas.microsoft.com/office/drawing/2015/9/8/chartex" xmlns:cx2="http://schemas.microsoft.com/office/drawing/2015/10/21/chartex" xmlns:cx3="http://schemas.microsoft.com/office/drawing/2016/5/9/chartex" xmlns:cx4="http://schemas.microsoft.com/office/drawing/2016/5/10/chartex" xmlns:cx5="http://schemas.microsoft.com/office/drawing/2016/5/11/chartex" xmlns:cx6="http://schemas.microsoft.com/office/drawing/2016/5/12/chartex" xmlns:cx7="http://schemas.microsoft.com/office/drawing/2016/5/13/chartex" xmlns:cx8="http://schemas.microsoft.com/office/drawing/2016/5/14/chartex" xmlns:mc="http://schemas.openxmlformats.org/markup-compatibility/2006" xmlns:aink="http://schemas.microsoft.com/office/drawing/2016/ink" xmlns:am3d="http://schemas.microsoft.com/office/drawing/2017/model3d" xmlns:o="urn:schemas-microsoft-com:office:office" xmlns:r="http://schemas.openxmlformats.org/officeDocument/2006/relationships" xmlns:m="http://schemas.openxmlformats.org/officeDocument/2006/math" xmlns:v="urn:schemas-microsoft-com:vml" xmlns:wp14="http://schemas.microsoft.com/office/word/2010/wordprocessingDrawing" xmlns:wp="http://schemas.openxmlformats.org/drawingml/2006/wordprocessingDrawing" xmlns:w10="urn:schemas-microsoft-com:office:word" xmlns:w="http://schemas.openxmlformats.org/wordprocessingml/2006/main" xmlns:w14="http://schemas.microsoft.com/office/word/2010/wordml" xmlns:w15="http://schemas.microsoft.com/office/word/2012/wordml" xmlns:w16cex="http://schemas.microsoft.com/office/word/2018/wordml/cex" xmlns:w16cid="http://schemas.microsoft.com/office/word/2016/wordml/cid" xmlns:w16="http://schemas.microsoft.com/office/word/2018/wordml" xmlns:w16sdtdh="http://schemas.microsoft.com/office/word/2020/wordml/sdtdatahash" xmlns:w16se="http://schemas.microsoft.com/office/word/2015/wordml/symex" xmlns:wpg="http://schemas.microsoft.com/office/word/2010/wordprocessingGroup" xmlns:wpi="http://schemas.microsoft.com/office/word/2010/wordprocessingInk" xmlns:wne="http://schemas.microsoft.com/office/word/2006/wordml" xmlns:wps="http://schemas.microsoft.com/office/word/2010/wordprocessingShape" mc:Ignorable="w14 w15 w16se w16cid w16 w16cex w16sdtdh wp14">
   <w:endnote w:type="separator" w:id="-1">
     <w:p>
       <w:pPr>
@@ -2947,7 +2917,7 @@
 </file>
 
 <file path=word/footnotes.xml><?xml version="1.0" encoding="utf-8"?>
-<w:footnotes xmlns:wpc="http://schemas.microsoft.com/office/word/2010/wordprocessingCanvas" xmlns:cx="http://schemas.microsoft.com/office/drawing/2014/chartex" xmlns:cx1="http://schemas.microsoft.com/office/drawing/2015/9/8/chartex" xmlns:cx2="http://schemas.microsoft.com/office/drawing/2015/10/21/chartex" xmlns:cx3="http://schemas.microsoft.com/office/drawing/2016/5/9/chartex" xmlns:cx4="http://schemas.microsoft.com/office/drawing/2016/5/10/chartex" xmlns:cx5="http://schemas.microsoft.com/office/drawing/2016/5/11/chartex" xmlns:cx6="http://schemas.microsoft.com/office/drawing/2016/5/12/chartex" xmlns:cx7="http://schemas.microsoft.com/office/drawing/2016/5/13/chartex" xmlns:cx8="http://schemas.microsoft.com/office/drawing/2016/5/14/chartex" xmlns:mc="http://schemas.openxmlformats.org/markup-compatibility/2006" xmlns:aink="http://schemas.microsoft.com/office/drawing/2016/ink" xmlns:am3d="http://schemas.microsoft.com/office/drawing/2017/model3d" xmlns:o="urn:schemas-microsoft-com:office:office" xmlns:oel="http://schemas.microsoft.com/office/2019/extlst" xmlns:r="http://schemas.openxmlformats.org/officeDocument/2006/relationships" xmlns:m="http://schemas.openxmlformats.org/officeDocument/2006/math" xmlns:v="urn:schemas-microsoft-com:vml" xmlns:wp14="http://schemas.microsoft.com/office/word/2010/wordprocessingDrawing" xmlns:wp="http://schemas.openxmlformats.org/drawingml/2006/wordprocessingDrawing" xmlns:w10="urn:schemas-microsoft-com:office:word" xmlns:w="http://schemas.openxmlformats.org/wordprocessingml/2006/main" xmlns:w14="http://schemas.microsoft.com/office/word/2010/wordml" xmlns:w15="http://schemas.microsoft.com/office/word/2012/wordml" xmlns:w16cex="http://schemas.microsoft.com/office/word/2018/wordml/cex" xmlns:w16cid="http://schemas.microsoft.com/office/word/2016/wordml/cid" xmlns:w16="http://schemas.microsoft.com/office/word/2018/wordml" xmlns:w16du="http://schemas.microsoft.com/office/word/2023/wordml/word16du" xmlns:w16sdtdh="http://schemas.microsoft.com/office/word/2020/wordml/sdtdatahash" xmlns:w16sdtfl="http://schemas.microsoft.com/office/word/2024/wordml/sdtformatlock" xmlns:w16se="http://schemas.microsoft.com/office/word/2015/wordml/symex" xmlns:wpg="http://schemas.microsoft.com/office/word/2010/wordprocessingGroup" xmlns:wpi="http://schemas.microsoft.com/office/word/2010/wordprocessingInk" xmlns:wne="http://schemas.microsoft.com/office/word/2006/wordml" xmlns:wps="http://schemas.microsoft.com/office/word/2010/wordprocessingShape" mc:Ignorable="w14 w15 w16se w16cid w16 w16cex w16sdtdh w16sdtfl w16du wp14">
+<w:footnotes xmlns:wpc="http://schemas.microsoft.com/office/word/2010/wordprocessingCanvas" xmlns:cx="http://schemas.microsoft.com/office/drawing/2014/chartex" xmlns:cx1="http://schemas.microsoft.com/office/drawing/2015/9/8/chartex" xmlns:cx2="http://schemas.microsoft.com/office/drawing/2015/10/21/chartex" xmlns:cx3="http://schemas.microsoft.com/office/drawing/2016/5/9/chartex" xmlns:cx4="http://schemas.microsoft.com/office/drawing/2016/5/10/chartex" xmlns:cx5="http://schemas.microsoft.com/office/drawing/2016/5/11/chartex" xmlns:cx6="http://schemas.microsoft.com/office/drawing/2016/5/12/chartex" xmlns:cx7="http://schemas.microsoft.com/office/drawing/2016/5/13/chartex" xmlns:cx8="http://schemas.microsoft.com/office/drawing/2016/5/14/chartex" xmlns:mc="http://schemas.openxmlformats.org/markup-compatibility/2006" xmlns:aink="http://schemas.microsoft.com/office/drawing/2016/ink" xmlns:am3d="http://schemas.microsoft.com/office/drawing/2017/model3d" xmlns:o="urn:schemas-microsoft-com:office:office" xmlns:r="http://schemas.openxmlformats.org/officeDocument/2006/relationships" xmlns:m="http://schemas.openxmlformats.org/officeDocument/2006/math" xmlns:v="urn:schemas-microsoft-com:vml" xmlns:wp14="http://schemas.microsoft.com/office/word/2010/wordprocessingDrawing" xmlns:wp="http://schemas.openxmlformats.org/drawingml/2006/wordprocessingDrawing" xmlns:w10="urn:schemas-microsoft-com:office:word" xmlns:w="http://schemas.openxmlformats.org/wordprocessingml/2006/main" xmlns:w14="http://schemas.microsoft.com/office/word/2010/wordml" xmlns:w15="http://schemas.microsoft.com/office/word/2012/wordml" xmlns:w16cex="http://schemas.microsoft.com/office/word/2018/wordml/cex" xmlns:w16cid="http://schemas.microsoft.com/office/word/2016/wordml/cid" xmlns:w16="http://schemas.microsoft.com/office/word/2018/wordml" xmlns:w16sdtdh="http://schemas.microsoft.com/office/word/2020/wordml/sdtdatahash" xmlns:w16se="http://schemas.microsoft.com/office/word/2015/wordml/symex" xmlns:wpg="http://schemas.microsoft.com/office/word/2010/wordprocessingGroup" xmlns:wpi="http://schemas.microsoft.com/office/word/2010/wordprocessingInk" xmlns:wne="http://schemas.microsoft.com/office/word/2006/wordml" xmlns:wps="http://schemas.microsoft.com/office/word/2010/wordprocessingShape" mc:Ignorable="w14 w15 w16se w16cid w16 w16cex w16sdtdh wp14">
   <w:footnote w:type="separator" w:id="-1">
     <w:p>
       <w:pPr>
@@ -2972,7 +2942,7 @@
 </file>
 
 <file path=word/header1.xml><?xml version="1.0" encoding="utf-8"?>
-<w:hdr xmlns:wpc="http://schemas.microsoft.com/office/word/2010/wordprocessingCanvas" xmlns:cx="http://schemas.microsoft.com/office/drawing/2014/chartex" xmlns:cx1="http://schemas.microsoft.com/office/drawing/2015/9/8/chartex" xmlns:cx2="http://schemas.microsoft.com/office/drawing/2015/10/21/chartex" xmlns:cx3="http://schemas.microsoft.com/office/drawing/2016/5/9/chartex" xmlns:cx4="http://schemas.microsoft.com/office/drawing/2016/5/10/chartex" xmlns:cx5="http://schemas.microsoft.com/office/drawing/2016/5/11/chartex" xmlns:cx6="http://schemas.microsoft.com/office/drawing/2016/5/12/chartex" xmlns:cx7="http://schemas.microsoft.com/office/drawing/2016/5/13/chartex" xmlns:cx8="http://schemas.microsoft.com/office/drawing/2016/5/14/chartex" xmlns:mc="http://schemas.openxmlformats.org/markup-compatibility/2006" xmlns:aink="http://schemas.microsoft.com/office/drawing/2016/ink" xmlns:am3d="http://schemas.microsoft.com/office/drawing/2017/model3d" xmlns:o="urn:schemas-microsoft-com:office:office" xmlns:oel="http://schemas.microsoft.com/office/2019/extlst" xmlns:r="http://schemas.openxmlformats.org/officeDocument/2006/relationships" xmlns:m="http://schemas.openxmlformats.org/officeDocument/2006/math" xmlns:v="urn:schemas-microsoft-com:vml" xmlns:wp14="http://schemas.microsoft.com/office/word/2010/wordprocessingDrawing" xmlns:wp="http://schemas.openxmlformats.org/drawingml/2006/wordprocessingDrawing" xmlns:w10="urn:schemas-microsoft-com:office:word" xmlns:w="http://schemas.openxmlformats.org/wordprocessingml/2006/main" xmlns:w14="http://schemas.microsoft.com/office/word/2010/wordml" xmlns:w15="http://schemas.microsoft.com/office/word/2012/wordml" xmlns:w16cex="http://schemas.microsoft.com/office/word/2018/wordml/cex" xmlns:w16cid="http://schemas.microsoft.com/office/word/2016/wordml/cid" xmlns:w16="http://schemas.microsoft.com/office/word/2018/wordml" xmlns:w16du="http://schemas.microsoft.com/office/word/2023/wordml/word16du" xmlns:w16sdtdh="http://schemas.microsoft.com/office/word/2020/wordml/sdtdatahash" xmlns:w16sdtfl="http://schemas.microsoft.com/office/word/2024/wordml/sdtformatlock" xmlns:w16se="http://schemas.microsoft.com/office/word/2015/wordml/symex" xmlns:wpg="http://schemas.microsoft.com/office/word/2010/wordprocessingGroup" xmlns:wpi="http://schemas.microsoft.com/office/word/2010/wordprocessingInk" xmlns:wne="http://schemas.microsoft.com/office/word/2006/wordml" xmlns:wps="http://schemas.microsoft.com/office/word/2010/wordprocessingShape" mc:Ignorable="w14 w15 w16se w16cid w16 w16cex w16sdtdh w16sdtfl w16du wp14">
+<w:hdr xmlns:wpc="http://schemas.microsoft.com/office/word/2010/wordprocessingCanvas" xmlns:cx="http://schemas.microsoft.com/office/drawing/2014/chartex" xmlns:cx1="http://schemas.microsoft.com/office/drawing/2015/9/8/chartex" xmlns:cx2="http://schemas.microsoft.com/office/drawing/2015/10/21/chartex" xmlns:cx3="http://schemas.microsoft.com/office/drawing/2016/5/9/chartex" xmlns:cx4="http://schemas.microsoft.com/office/drawing/2016/5/10/chartex" xmlns:cx5="http://schemas.microsoft.com/office/drawing/2016/5/11/chartex" xmlns:cx6="http://schemas.microsoft.com/office/drawing/2016/5/12/chartex" xmlns:cx7="http://schemas.microsoft.com/office/drawing/2016/5/13/chartex" xmlns:cx8="http://schemas.microsoft.com/office/drawing/2016/5/14/chartex" xmlns:mc="http://schemas.openxmlformats.org/markup-compatibility/2006" xmlns:aink="http://schemas.microsoft.com/office/drawing/2016/ink" xmlns:am3d="http://schemas.microsoft.com/office/drawing/2017/model3d" xmlns:o="urn:schemas-microsoft-com:office:office" xmlns:r="http://schemas.openxmlformats.org/officeDocument/2006/relationships" xmlns:m="http://schemas.openxmlformats.org/officeDocument/2006/math" xmlns:v="urn:schemas-microsoft-com:vml" xmlns:wp14="http://schemas.microsoft.com/office/word/2010/wordprocessingDrawing" xmlns:wp="http://schemas.openxmlformats.org/drawingml/2006/wordprocessingDrawing" xmlns:w10="urn:schemas-microsoft-com:office:word" xmlns:w="http://schemas.openxmlformats.org/wordprocessingml/2006/main" xmlns:w14="http://schemas.microsoft.com/office/word/2010/wordml" xmlns:w15="http://schemas.microsoft.com/office/word/2012/wordml" xmlns:w16cex="http://schemas.microsoft.com/office/word/2018/wordml/cex" xmlns:w16cid="http://schemas.microsoft.com/office/word/2016/wordml/cid" xmlns:w16="http://schemas.microsoft.com/office/word/2018/wordml" xmlns:w16sdtdh="http://schemas.microsoft.com/office/word/2020/wordml/sdtdatahash" xmlns:w16se="http://schemas.microsoft.com/office/word/2015/wordml/symex" xmlns:wpg="http://schemas.microsoft.com/office/word/2010/wordprocessingGroup" xmlns:wpi="http://schemas.microsoft.com/office/word/2010/wordprocessingInk" xmlns:wne="http://schemas.microsoft.com/office/word/2006/wordml" xmlns:wps="http://schemas.microsoft.com/office/word/2010/wordprocessingShape" mc:Ignorable="w14 w15 w16se w16cid w16 w16cex w16sdtdh wp14">
   <w:p>
     <w:pPr>
       <w:pStyle w:val="Encabezado"/>
@@ -2985,7 +2955,7 @@
 </file>
 
 <file path=word/styles.xml><?xml version="1.0" encoding="utf-8"?>
-<w:styles xmlns:mc="http://schemas.openxmlformats.org/markup-compatibility/2006" xmlns:r="http://schemas.openxmlformats.org/officeDocument/2006/relationships" xmlns:w="http://schemas.openxmlformats.org/wordprocessingml/2006/main" xmlns:w14="http://schemas.microsoft.com/office/word/2010/wordml" xmlns:w15="http://schemas.microsoft.com/office/word/2012/wordml" xmlns:w16cex="http://schemas.microsoft.com/office/word/2018/wordml/cex" xmlns:w16cid="http://schemas.microsoft.com/office/word/2016/wordml/cid" xmlns:w16="http://schemas.microsoft.com/office/word/2018/wordml" xmlns:w16du="http://schemas.microsoft.com/office/word/2023/wordml/word16du" xmlns:w16sdtdh="http://schemas.microsoft.com/office/word/2020/wordml/sdtdatahash" xmlns:w16sdtfl="http://schemas.microsoft.com/office/word/2024/wordml/sdtformatlock" xmlns:w16se="http://schemas.microsoft.com/office/word/2015/wordml/symex" mc:Ignorable="w14 w15 w16se w16cid w16 w16cex w16sdtdh w16sdtfl w16du">
+<w:styles xmlns:mc="http://schemas.openxmlformats.org/markup-compatibility/2006" xmlns:r="http://schemas.openxmlformats.org/officeDocument/2006/relationships" xmlns:w="http://schemas.openxmlformats.org/wordprocessingml/2006/main" xmlns:w14="http://schemas.microsoft.com/office/word/2010/wordml" xmlns:w15="http://schemas.microsoft.com/office/word/2012/wordml" xmlns:w16cex="http://schemas.microsoft.com/office/word/2018/wordml/cex" xmlns:w16cid="http://schemas.microsoft.com/office/word/2016/wordml/cid" xmlns:w16="http://schemas.microsoft.com/office/word/2018/wordml" xmlns:w16sdtdh="http://schemas.microsoft.com/office/word/2020/wordml/sdtdatahash" xmlns:w16se="http://schemas.microsoft.com/office/word/2015/wordml/symex" mc:Ignorable="w14 w15 w16se w16cid w16 w16cex w16sdtdh">
   <w:docDefaults>
     <w:rPrDefault>
       <w:rPr>
@@ -3588,6 +3558,7 @@
   <w:style w:type="character" w:default="1" w:styleId="Fuentedeprrafopredeter">
     <w:name w:val="Default Paragraph Font"/>
     <w:uiPriority w:val="1"/>
+    <w:semiHidden/>
     <w:unhideWhenUsed/>
   </w:style>
   <w:style w:type="table" w:default="1" w:styleId="Tablanormal">

</xml_diff>

<commit_message>
Actualización del listado de requisitos y corrección de variable en la vista de favoritos
</commit_message>
<xml_diff>
--- a/listadoRequisitos.docx
+++ b/listadoRequisitos.docx
@@ -2945,13 +2945,212 @@
               <w:rPr>
                 <w:rFonts w:ascii="Calibri" w:hAnsi="Calibri" w:cs="Calibri"/>
               </w:rPr>
+              <w:t>16</w:t>
+            </w:r>
+          </w:p>
+        </w:tc>
+      </w:tr>
+      <w:tr>
+        <w:tc>
+          <w:tcPr>
+            <w:tcW w:w="4247" w:type="dxa"/>
+          </w:tcPr>
+          <w:p>
+            <w:pPr>
+              <w:jc w:val="both"/>
+              <w:rPr>
+                <w:rFonts w:ascii="Calibri" w:hAnsi="Calibri" w:cs="Calibri"/>
+              </w:rPr>
+            </w:pPr>
+            <w:r>
+              <w:rPr>
+                <w:rFonts w:ascii="Calibri" w:hAnsi="Calibri" w:cs="Calibri"/>
+              </w:rPr>
+              <w:t>Nombre del Requerimiento:</w:t>
+            </w:r>
+          </w:p>
+        </w:tc>
+        <w:tc>
+          <w:tcPr>
+            <w:tcW w:w="4247" w:type="dxa"/>
+          </w:tcPr>
+          <w:p>
+            <w:pPr>
+              <w:jc w:val="both"/>
+              <w:rPr>
+                <w:rFonts w:ascii="Calibri" w:hAnsi="Calibri" w:cs="Calibri"/>
+              </w:rPr>
+            </w:pPr>
+            <w:r>
+              <w:rPr>
+                <w:rFonts w:ascii="Calibri" w:hAnsi="Calibri" w:cs="Calibri"/>
+              </w:rPr>
+              <w:t>Panel de administración de zapatillas</w:t>
+            </w:r>
+          </w:p>
+        </w:tc>
+      </w:tr>
+      <w:tr>
+        <w:tc>
+          <w:tcPr>
+            <w:tcW w:w="4247" w:type="dxa"/>
+          </w:tcPr>
+          <w:p>
+            <w:pPr>
+              <w:jc w:val="both"/>
+              <w:rPr>
+                <w:rFonts w:ascii="Calibri" w:hAnsi="Calibri" w:cs="Calibri"/>
+              </w:rPr>
+            </w:pPr>
+            <w:r>
+              <w:rPr>
+                <w:rFonts w:ascii="Calibri" w:hAnsi="Calibri" w:cs="Calibri"/>
+              </w:rPr>
+              <w:t>Descripción:</w:t>
+            </w:r>
+          </w:p>
+        </w:tc>
+        <w:tc>
+          <w:tcPr>
+            <w:tcW w:w="4247" w:type="dxa"/>
+          </w:tcPr>
+          <w:p>
+            <w:pPr>
+              <w:jc w:val="both"/>
+              <w:rPr>
+                <w:rFonts w:ascii="Calibri" w:hAnsi="Calibri" w:cs="Calibri"/>
+              </w:rPr>
+            </w:pPr>
+            <w:r>
+              <w:rPr>
+                <w:rFonts w:ascii="Calibri" w:hAnsi="Calibri" w:cs="Calibri"/>
+              </w:rPr>
+              <w:t>El sistema debe incluir un panel de administración accesible solo para usuarios con rol "</w:t>
+            </w:r>
+            <w:proofErr w:type="spellStart"/>
+            <w:r>
+              <w:rPr>
+                <w:rFonts w:ascii="Calibri" w:hAnsi="Calibri" w:cs="Calibri"/>
+              </w:rPr>
+              <w:t>admin</w:t>
+            </w:r>
+            <w:proofErr w:type="spellEnd"/>
+            <w:r>
+              <w:rPr>
+                <w:rFonts w:ascii="Calibri" w:hAnsi="Calibri" w:cs="Calibri"/>
+              </w:rPr>
+              <w:t>" que permita añadir, editar, eliminar y gestionar todos los modelos de zapatillas del catálogo.</w:t>
+            </w:r>
+          </w:p>
+        </w:tc>
+      </w:tr>
+      <w:tr>
+        <w:tc>
+          <w:tcPr>
+            <w:tcW w:w="4247" w:type="dxa"/>
+          </w:tcPr>
+          <w:p>
+            <w:pPr>
+              <w:jc w:val="both"/>
+              <w:rPr>
+                <w:rFonts w:ascii="Calibri" w:hAnsi="Calibri" w:cs="Calibri"/>
+              </w:rPr>
+            </w:pPr>
+            <w:r>
+              <w:rPr>
+                <w:rFonts w:ascii="Calibri" w:hAnsi="Calibri" w:cs="Calibri"/>
+              </w:rPr>
+              <w:t>Prioridad:</w:t>
+            </w:r>
+          </w:p>
+        </w:tc>
+        <w:tc>
+          <w:tcPr>
+            <w:tcW w:w="4247" w:type="dxa"/>
+          </w:tcPr>
+          <w:p>
+            <w:pPr>
+              <w:jc w:val="both"/>
+              <w:rPr>
+                <w:rFonts w:ascii="Calibri" w:hAnsi="Calibri" w:cs="Calibri"/>
+              </w:rPr>
+            </w:pPr>
+            <w:r>
+              <w:rPr>
+                <w:rFonts w:ascii="Calibri" w:hAnsi="Calibri" w:cs="Calibri"/>
+              </w:rPr>
+              <w:t>Alta</w:t>
+            </w:r>
+          </w:p>
+        </w:tc>
+      </w:tr>
+    </w:tbl>
+    <w:p>
+      <w:pPr>
+        <w:jc w:val="both"/>
+        <w:rPr>
+          <w:rFonts w:ascii="Calibri" w:hAnsi="Calibri" w:cs="Calibri"/>
+        </w:rPr>
+      </w:pPr>
+    </w:p>
+    <w:tbl>
+      <w:tblPr>
+        <w:tblStyle w:val="Tablaconcuadrcula"/>
+        <w:tblW w:w="0" w:type="auto"/>
+        <w:tblLook w:val="04A0" w:firstRow="1" w:lastRow="0" w:firstColumn="1" w:lastColumn="0" w:noHBand="0" w:noVBand="1"/>
+      </w:tblPr>
+      <w:tblGrid>
+        <w:gridCol w:w="4247"/>
+        <w:gridCol w:w="4247"/>
+      </w:tblGrid>
+      <w:tr>
+        <w:tc>
+          <w:tcPr>
+            <w:tcW w:w="4247" w:type="dxa"/>
+          </w:tcPr>
+          <w:p>
+            <w:pPr>
+              <w:jc w:val="both"/>
+              <w:rPr>
+                <w:rFonts w:ascii="Calibri" w:hAnsi="Calibri" w:cs="Calibri"/>
+              </w:rPr>
+            </w:pPr>
+            <w:r>
+              <w:rPr>
+                <w:rFonts w:ascii="Calibri" w:hAnsi="Calibri" w:cs="Calibri"/>
+              </w:rPr>
+              <w:t>ID del Requerimiento:</w:t>
+            </w:r>
+          </w:p>
+        </w:tc>
+        <w:tc>
+          <w:tcPr>
+            <w:tcW w:w="4247" w:type="dxa"/>
+          </w:tcPr>
+          <w:p>
+            <w:pPr>
+              <w:jc w:val="both"/>
+              <w:rPr>
+                <w:rFonts w:ascii="Calibri" w:hAnsi="Calibri" w:cs="Calibri"/>
+              </w:rPr>
+            </w:pPr>
+            <w:r>
+              <w:rPr>
+                <w:rFonts w:ascii="Calibri" w:hAnsi="Calibri" w:cs="Calibri"/>
+              </w:rPr>
+              <w:t>RFP-0</w:t>
+            </w:r>
+            <w:r>
+              <w:rPr>
+                <w:rFonts w:ascii="Calibri" w:hAnsi="Calibri" w:cs="Calibri"/>
+              </w:rPr>
               <w:t>1</w:t>
             </w:r>
             <w:r>
               <w:rPr>
                 <w:rFonts w:ascii="Calibri" w:hAnsi="Calibri" w:cs="Calibri"/>
               </w:rPr>
-              <w:t>6</w:t>
+              <w:t>7</w:t>
             </w:r>
           </w:p>
         </w:tc>
@@ -2991,7 +3190,7 @@
               <w:rPr>
                 <w:rFonts w:ascii="Calibri" w:hAnsi="Calibri" w:cs="Calibri"/>
               </w:rPr>
-              <w:t>Panel de administración de zapatillas</w:t>
+              <w:t>Ranking de zapatillas más favoritas</w:t>
             </w:r>
           </w:p>
         </w:tc>
@@ -3031,21 +3230,7 @@
               <w:rPr>
                 <w:rFonts w:ascii="Calibri" w:hAnsi="Calibri" w:cs="Calibri"/>
               </w:rPr>
-              <w:t>El sistema debe incluir un panel de administración accesible solo para usuarios con rol "</w:t>
-            </w:r>
-            <w:proofErr w:type="spellStart"/>
-            <w:r>
-              <w:rPr>
-                <w:rFonts w:ascii="Calibri" w:hAnsi="Calibri" w:cs="Calibri"/>
-              </w:rPr>
-              <w:t>admin</w:t>
-            </w:r>
-            <w:proofErr w:type="spellEnd"/>
-            <w:r>
-              <w:rPr>
-                <w:rFonts w:ascii="Calibri" w:hAnsi="Calibri" w:cs="Calibri"/>
-              </w:rPr>
-              <w:t>" que permita añadir, editar, eliminar y gestionar todos los modelos de zapatillas del catálogo.</w:t>
+              <w:t>El sistema debe mostrar una sección o página con el listado de las zapatillas que más favoritos tienen, ordenadas de mayor a menor, indicando el número total de favoritos de cada una.</w:t>
             </w:r>
           </w:p>
         </w:tc>
@@ -3573,7 +3758,7 @@
   <w:style w:type="paragraph" w:default="1" w:styleId="Normal">
     <w:name w:val="Normal"/>
     <w:qFormat/>
-    <w:rsid w:val="002C1022"/>
+    <w:rsid w:val="00F650D2"/>
   </w:style>
   <w:style w:type="paragraph" w:styleId="Ttulo1">
     <w:name w:val="heading 1"/>

</xml_diff>

<commit_message>
Optimizaciones SEO y rendimiento: logo WebP, preload CSS, meta description, accesibilidad, cache Nginx
</commit_message>
<xml_diff>
--- a/listadoRequisitos.docx
+++ b/listadoRequisitos.docx
@@ -153,21 +153,7 @@
               <w:rPr>
                 <w:rFonts w:ascii="Calibri" w:hAnsi="Calibri" w:cs="Calibri"/>
               </w:rPr>
-              <w:t xml:space="preserve">El sistema debe mostrar una lista de zapatillas en formato </w:t>
-            </w:r>
-            <w:proofErr w:type="spellStart"/>
-            <w:r>
-              <w:rPr>
-                <w:rFonts w:ascii="Calibri" w:hAnsi="Calibri" w:cs="Calibri"/>
-              </w:rPr>
-              <w:t>grid</w:t>
-            </w:r>
-            <w:proofErr w:type="spellEnd"/>
-            <w:r>
-              <w:rPr>
-                <w:rFonts w:ascii="Calibri" w:hAnsi="Calibri" w:cs="Calibri"/>
-              </w:rPr>
-              <w:t>, donde cada tarjeta incluya la imagen del producto, su nombre y su SKU.</w:t>
+              <w:t>El sistema debe mostrar una lista de zapatillas en formato grid, donde cada tarjeta incluya la imagen del producto, su nombre y su SKU.</w:t>
             </w:r>
           </w:p>
         </w:tc>
@@ -2670,7 +2656,7 @@
               <w:rPr>
                 <w:rFonts w:ascii="Calibri" w:hAnsi="Calibri" w:cs="Calibri"/>
               </w:rPr>
-              <w:t>Media</w:t>
+              <w:t>Baja</w:t>
             </w:r>
           </w:p>
         </w:tc>
@@ -3025,21 +3011,7 @@
               <w:rPr>
                 <w:rFonts w:ascii="Calibri" w:hAnsi="Calibri" w:cs="Calibri"/>
               </w:rPr>
-              <w:t>El sistema debe incluir un panel de administración accesible solo para usuarios con rol "</w:t>
-            </w:r>
-            <w:proofErr w:type="spellStart"/>
-            <w:r>
-              <w:rPr>
-                <w:rFonts w:ascii="Calibri" w:hAnsi="Calibri" w:cs="Calibri"/>
-              </w:rPr>
-              <w:t>admin</w:t>
-            </w:r>
-            <w:proofErr w:type="spellEnd"/>
-            <w:r>
-              <w:rPr>
-                <w:rFonts w:ascii="Calibri" w:hAnsi="Calibri" w:cs="Calibri"/>
-              </w:rPr>
-              <w:t>" que permita añadir, editar, eliminar y gestionar todos los modelos de zapatillas del catálogo.</w:t>
+              <w:t>El sistema debe incluir un panel de administración accesible solo para usuarios con rol "admin" que permita añadir, editar, eliminar y gestionar todos los modelos de zapatillas del catálogo.</w:t>
             </w:r>
           </w:p>
         </w:tc>
@@ -3144,13 +3116,7 @@
               <w:rPr>
                 <w:rFonts w:ascii="Calibri" w:hAnsi="Calibri" w:cs="Calibri"/>
               </w:rPr>
-              <w:t>1</w:t>
-            </w:r>
-            <w:r>
-              <w:rPr>
-                <w:rFonts w:ascii="Calibri" w:hAnsi="Calibri" w:cs="Calibri"/>
-              </w:rPr>
-              <w:t>7</w:t>
+              <w:t>17</w:t>
             </w:r>
           </w:p>
         </w:tc>

</xml_diff>